<commit_message>
Nouvelle version des modèles
</commit_message>
<xml_diff>
--- a/reste à faire.docx
+++ b/reste à faire.docx
@@ -47,9 +47,21 @@
           <w:color w:val="00B050"/>
           <w:lang w:val="fr-MA"/>
         </w:rPr>
-        <w:t>**(Done</w:t>
-      </w:r>
-      <w:proofErr w:type="gramStart"/>
+        <w:t>**(Done) :::::::::: les variables doivent respecter le mapping fournis**</w:t>
+      </w:r>
+    </w:p>
+    <w:p>
+      <w:pPr>
+        <w:rPr>
+          <w:lang w:val="fr-MA"/>
+        </w:rPr>
+      </w:pPr>
+      <w:r>
+        <w:rPr>
+          <w:lang w:val="fr-MA"/>
+        </w:rPr>
+        <w:t xml:space="preserve">* Ajouter filtre par campagne dans le centre contact client </w:t>
+      </w:r>
       <w:r>
         <w:rPr>
           <w:b/>
@@ -57,9 +69,21 @@
           <w:color w:val="00B050"/>
           <w:lang w:val="fr-MA"/>
         </w:rPr>
-        <w:t>) ::::::::::</w:t>
-      </w:r>
-      <w:proofErr w:type="gramEnd"/>
+        <w:t>**(Done)**</w:t>
+      </w:r>
+    </w:p>
+    <w:p>
+      <w:pPr>
+        <w:rPr>
+          <w:lang w:val="fr-MA"/>
+        </w:rPr>
+      </w:pPr>
+      <w:r>
+        <w:rPr>
+          <w:lang w:val="fr-MA"/>
+        </w:rPr>
+        <w:t xml:space="preserve">* Ajouter le KPI client arrivant à échéance </w:t>
+      </w:r>
       <w:r>
         <w:rPr>
           <w:b/>
@@ -67,20 +91,20 @@
           <w:color w:val="00B050"/>
           <w:lang w:val="fr-MA"/>
         </w:rPr>
-        <w:t xml:space="preserve"> les variables doivent respecter le mapping fournis**</w:t>
-      </w:r>
-    </w:p>
-    <w:p>
-      <w:pPr>
-        <w:rPr>
-          <w:lang w:val="fr-MA"/>
-        </w:rPr>
-      </w:pPr>
-      <w:r>
-        <w:rPr>
-          <w:lang w:val="fr-MA"/>
-        </w:rPr>
-        <w:t xml:space="preserve">* Ajouter filtre par campagne dans le centre contact client </w:t>
+        <w:t>**(Done)**</w:t>
+      </w:r>
+    </w:p>
+    <w:p>
+      <w:pPr>
+        <w:rPr>
+          <w:lang w:val="fr-MA"/>
+        </w:rPr>
+      </w:pPr>
+      <w:r>
+        <w:rPr>
+          <w:lang w:val="fr-MA"/>
+        </w:rPr>
+        <w:t xml:space="preserve">* Mettre les arrivant à échéance en priorité dans les queues comme client urgent </w:t>
       </w:r>
       <w:r>
         <w:rPr>
@@ -102,7 +126,7 @@
         <w:rPr>
           <w:lang w:val="fr-MA"/>
         </w:rPr>
-        <w:t xml:space="preserve">* Ajouter le KPI client arrivant à échéance </w:t>
+        <w:t xml:space="preserve">* Mettre bouton retour arrière dans le centre de contact client </w:t>
       </w:r>
       <w:r>
         <w:rPr>
@@ -117,36 +141,17 @@
     <w:p>
       <w:pPr>
         <w:rPr>
-          <w:lang w:val="fr-MA"/>
-        </w:rPr>
-      </w:pPr>
-      <w:r>
-        <w:rPr>
-          <w:lang w:val="fr-MA"/>
-        </w:rPr>
-        <w:t xml:space="preserve">* Mettre les arrivant à échéance en priorité dans les queues comme client urgent </w:t>
-      </w:r>
-      <w:r>
-        <w:rPr>
           <w:b/>
           <w:bCs/>
           <w:color w:val="00B050"/>
           <w:lang w:val="fr-MA"/>
         </w:rPr>
-        <w:t>**(Done)**</w:t>
-      </w:r>
-    </w:p>
-    <w:p>
-      <w:pPr>
-        <w:rPr>
-          <w:lang w:val="fr-MA"/>
-        </w:rPr>
-      </w:pPr>
-      <w:r>
-        <w:rPr>
-          <w:lang w:val="fr-MA"/>
-        </w:rPr>
-        <w:t xml:space="preserve">* Mettre bouton retour arrière dans le centre de contact client </w:t>
+      </w:pPr>
+      <w:r>
+        <w:rPr>
+          <w:lang w:val="fr-MA"/>
+        </w:rPr>
+        <w:t xml:space="preserve">* Flaguer sur les clients urgent dans les queues </w:t>
       </w:r>
       <w:r>
         <w:rPr>
@@ -161,17 +166,348 @@
     <w:p>
       <w:pPr>
         <w:rPr>
+          <w:lang w:val="fr-MA"/>
+        </w:rPr>
+      </w:pPr>
+    </w:p>
+    <w:p>
+      <w:pPr>
+        <w:rPr>
+          <w:lang w:val="fr-MA"/>
+        </w:rPr>
+      </w:pPr>
+      <w:r>
+        <w:rPr>
+          <w:lang w:val="fr-MA"/>
+        </w:rPr>
+        <w:t xml:space="preserve">* Corriger l’api d’envoi des valeurs </w:t>
+      </w:r>
+      <w:r>
+        <w:rPr>
+          <w:lang w:val="fr-MA"/>
+        </w:rPr>
+        <w:t xml:space="preserve">pour les conditions / formulaire / objectifs / cible </w:t>
+      </w:r>
+      <w:r>
+        <w:rPr>
+          <w:lang w:val="fr-MA"/>
+        </w:rPr>
+        <w:t xml:space="preserve">(ne dois pas prendre </w:t>
+      </w:r>
+      <w:r>
+        <w:rPr>
+          <w:lang w:val="fr-MA"/>
+        </w:rPr>
+        <w:t>les valeurs distinctes</w:t>
+      </w:r>
+      <w:r>
+        <w:rPr>
+          <w:lang w:val="fr-MA"/>
+        </w:rPr>
+        <w:t xml:space="preserve"> dans la base de données, mais exposé toutes les modalités)</w:t>
+      </w:r>
+    </w:p>
+    <w:p>
+      <w:pPr>
+        <w:rPr>
+          <w:lang w:val="fr-MA"/>
+        </w:rPr>
+      </w:pPr>
+      <w:r>
+        <w:rPr>
+          <w:lang w:val="fr-MA"/>
+        </w:rPr>
+        <w:t>* Rendre les blocs multi parents</w:t>
+      </w:r>
+    </w:p>
+    <w:p>
+      <w:pPr>
+        <w:rPr>
+          <w:lang w:val="fr-MA"/>
+        </w:rPr>
+      </w:pPr>
+      <w:r>
+        <w:rPr>
+          <w:lang w:val="fr-MA"/>
+        </w:rPr>
+        <w:t>*</w:t>
+      </w:r>
+      <w:r>
+        <w:rPr>
+          <w:lang w:val="fr-MA"/>
+        </w:rPr>
+        <w:t xml:space="preserve"> Pouvoir créer des objets et drag and drop</w:t>
+      </w:r>
+    </w:p>
+    <w:p>
+      <w:pPr>
+        <w:rPr>
+          <w:lang w:val="fr-MA"/>
+        </w:rPr>
+      </w:pPr>
+      <w:r>
+        <w:rPr>
+          <w:lang w:val="fr-MA"/>
+        </w:rPr>
+        <w:t xml:space="preserve">* </w:t>
+      </w:r>
+      <w:r>
+        <w:rPr>
+          <w:lang w:val="fr-MA"/>
+        </w:rPr>
+        <w:t>Créer une boucle de relance dans les modèles</w:t>
+      </w:r>
+    </w:p>
+    <w:p>
+      <w:pPr>
+        <w:rPr>
+          <w:lang w:val="fr-MA"/>
+        </w:rPr>
+      </w:pPr>
+      <w:r>
+        <w:rPr>
+          <w:lang w:val="fr-MA"/>
+        </w:rPr>
+        <w:t>* Ajouter le canal notification push</w:t>
+      </w:r>
+    </w:p>
+    <w:p>
+      <w:pPr>
+        <w:rPr>
+          <w:lang w:val="fr-MA"/>
+        </w:rPr>
+      </w:pPr>
+    </w:p>
+    <w:p>
+      <w:pPr>
+        <w:rPr>
+          <w:lang w:val="fr-MA"/>
+        </w:rPr>
+      </w:pPr>
+      <w:r>
+        <w:rPr>
+          <w:lang w:val="fr-MA"/>
+        </w:rPr>
+        <w:t xml:space="preserve">* Tracking </w:t>
+      </w:r>
+      <w:r>
+        <w:rPr>
+          <w:lang w:val="fr-MA"/>
+        </w:rPr>
+        <w:t>des liens envoyés</w:t>
+      </w:r>
+      <w:r>
+        <w:rPr>
+          <w:lang w:val="fr-MA"/>
+        </w:rPr>
+        <w:t xml:space="preserve"> par mail</w:t>
+      </w:r>
+    </w:p>
+    <w:p>
+      <w:pPr>
+        <w:rPr>
+          <w:lang w:val="fr-MA"/>
+        </w:rPr>
+      </w:pPr>
+      <w:r>
+        <w:rPr>
+          <w:lang w:val="fr-MA"/>
+        </w:rPr>
+        <w:t>* Gérer les accès du collaborateur, créer un mapping matricule/fonction (DA/CC/DGA…)</w:t>
+      </w:r>
+      <w:r>
+        <w:rPr>
+          <w:lang w:val="fr-MA"/>
+        </w:rPr>
+        <w:t xml:space="preserve"> dans une nouvelle table</w:t>
+      </w:r>
+      <w:r>
+        <w:rPr>
+          <w:lang w:val="fr-MA"/>
+        </w:rPr>
+        <w:br/>
+      </w:r>
+    </w:p>
+    <w:p>
+      <w:pPr>
+        <w:rPr>
+          <w:lang w:val="fr-MA"/>
+        </w:rPr>
+      </w:pPr>
+      <w:r>
+        <w:rPr>
+          <w:lang w:val="fr-MA"/>
+        </w:rPr>
+        <w:t xml:space="preserve">* Archive des campagnes dans l'interface </w:t>
+      </w:r>
+      <w:r>
+        <w:rPr>
+          <w:b/>
+          <w:bCs/>
+          <w:lang w:val="fr-MA"/>
+        </w:rPr>
+        <w:t>**(sera fait au niveau du front avec l'API)**</w:t>
+      </w:r>
+    </w:p>
+    <w:p>
+      <w:pPr>
+        <w:rPr>
+          <w:lang w:val="fr-MA"/>
+        </w:rPr>
+      </w:pPr>
+      <w:r>
+        <w:rPr>
+          <w:lang w:val="fr-MA"/>
+        </w:rPr>
+        <w:t xml:space="preserve">* Retirer modifier modèle/cible du back </w:t>
+      </w:r>
+      <w:r>
+        <w:rPr>
+          <w:b/>
+          <w:bCs/>
+          <w:lang w:val="fr-MA"/>
+        </w:rPr>
+        <w:t>**(sera fait au niveau du front, duplication + modifs)**</w:t>
+      </w:r>
+    </w:p>
+    <w:p>
+      <w:pPr>
+        <w:rPr>
+          <w:lang w:val="fr-MA"/>
+        </w:rPr>
+      </w:pPr>
+      <w:r>
+        <w:rPr>
+          <w:lang w:val="fr-MA"/>
+        </w:rPr>
+        <w:br/>
+      </w:r>
+    </w:p>
+    <w:p>
+      <w:pPr>
+        <w:rPr>
+          <w:lang w:val="fr-MA"/>
+        </w:rPr>
+      </w:pPr>
+      <w:r>
+        <w:rPr>
+          <w:lang w:val="fr-MA"/>
+        </w:rPr>
+        <w:t>* Etat modèle et état cible (Supprimé ou Actif, les modèles supprimés ne disparaitrons plus définitivement)</w:t>
+      </w:r>
+    </w:p>
+    <w:p>
+      <w:pPr>
+        <w:rPr>
+          <w:lang w:val="fr-MA"/>
+        </w:rPr>
+      </w:pPr>
+      <w:r>
+        <w:rPr>
+          <w:lang w:val="fr-MA"/>
+        </w:rPr>
+        <w:t>* Quand DA ou CC viennent après Appel, ajouter une interface de choix des horaires (synchronisé avec Outlook / Lotus note)</w:t>
+      </w:r>
+    </w:p>
+    <w:p>
+      <w:pPr>
+        <w:rPr>
+          <w:lang w:val="fr-MA"/>
+        </w:rPr>
+      </w:pPr>
+      <w:r>
+        <w:rPr>
+          <w:lang w:val="fr-MA"/>
+        </w:rPr>
+        <w:t>* Sur serveur, Rendre batch manuel schedulable</w:t>
+      </w:r>
+    </w:p>
+    <w:p>
+      <w:pPr>
+        <w:rPr>
+          <w:lang w:val="fr-MA"/>
+        </w:rPr>
+      </w:pPr>
+      <w:r>
+        <w:rPr>
+          <w:lang w:val="fr-MA"/>
+        </w:rPr>
+        <w:t>* Ajouter les tiers dans ls tables clients et client\_campagne</w:t>
+      </w:r>
+    </w:p>
+    <w:p>
+      <w:pPr>
+        <w:rPr>
+          <w:lang w:val="fr-MA"/>
+        </w:rPr>
+      </w:pPr>
+      <w:r>
+        <w:rPr>
+          <w:lang w:val="fr-MA"/>
+        </w:rPr>
+        <w:br/>
+      </w:r>
+    </w:p>
+    <w:p>
+      <w:pPr>
+        <w:rPr>
+          <w:lang w:val="fr-MA"/>
+        </w:rPr>
+      </w:pPr>
+      <w:r>
+        <w:rPr>
+          <w:lang w:val="fr-MA"/>
+        </w:rPr>
+        <w:lastRenderedPageBreak/>
+        <w:t>======== Modifs ========</w:t>
+      </w:r>
+    </w:p>
+    <w:p>
+      <w:pPr>
+        <w:rPr>
+          <w:lang w:val="fr-MA"/>
+        </w:rPr>
+      </w:pPr>
+      <w:r>
+        <w:rPr>
+          <w:lang w:val="fr-MA"/>
+        </w:rPr>
+        <w:br/>
+      </w:r>
+    </w:p>
+    <w:p>
+      <w:pPr>
+        <w:rPr>
+          <w:lang w:val="fr-MA"/>
+        </w:rPr>
+      </w:pPr>
+      <w:r>
+        <w:rPr>
+          <w:lang w:val="fr-MA"/>
+        </w:rPr>
+        <w:t xml:space="preserve">* CSV Conforme à la base de données </w:t>
+      </w:r>
+      <w:r>
+        <w:rPr>
           <w:b/>
           <w:bCs/>
           <w:color w:val="00B050"/>
           <w:lang w:val="fr-MA"/>
         </w:rPr>
-      </w:pPr>
-      <w:r>
-        <w:rPr>
-          <w:lang w:val="fr-MA"/>
-        </w:rPr>
-        <w:t xml:space="preserve">* Flaguer sur les clients urgent dans les queues </w:t>
+        <w:t>**(Done) :::::::::: Fournir exemple pour tester**</w:t>
+      </w:r>
+    </w:p>
+    <w:p>
+      <w:pPr>
+        <w:rPr>
+          <w:lang w:val="fr-MA"/>
+        </w:rPr>
+      </w:pPr>
+      <w:r>
+        <w:rPr>
+          <w:lang w:val="fr-MA"/>
+        </w:rPr>
+        <w:t xml:space="preserve">* Cible de la campagne se met à jour avec le batch (s'il y'a de nouveaux clients) </w:t>
       </w:r>
       <w:r>
         <w:rPr>
@@ -193,79 +529,15 @@
         <w:rPr>
           <w:lang w:val="fr-MA"/>
         </w:rPr>
-        <w:t>* Créer une boucle de relance dans les modèles</w:t>
-      </w:r>
-    </w:p>
-    <w:p>
-      <w:pPr>
-        <w:rPr>
-          <w:lang w:val="fr-MA"/>
-        </w:rPr>
-      </w:pPr>
-      <w:r>
-        <w:rPr>
-          <w:lang w:val="fr-MA"/>
-        </w:rPr>
-        <w:t>* Ajouter le canal notification push</w:t>
-      </w:r>
-    </w:p>
-    <w:p>
-      <w:pPr>
-        <w:rPr>
-          <w:lang w:val="fr-MA"/>
-        </w:rPr>
-      </w:pPr>
-      <w:r>
-        <w:rPr>
-          <w:lang w:val="fr-MA"/>
-        </w:rPr>
-        <w:t xml:space="preserve">* </w:t>
-      </w:r>
-      <w:proofErr w:type="spellStart"/>
-      <w:r>
-        <w:rPr>
-          <w:lang w:val="fr-MA"/>
-        </w:rPr>
-        <w:t>Tracking</w:t>
-      </w:r>
-      <w:proofErr w:type="spellEnd"/>
-      <w:r>
-        <w:rPr>
-          <w:lang w:val="fr-MA"/>
-        </w:rPr>
-        <w:t xml:space="preserve"> </w:t>
-      </w:r>
-      <w:r>
-        <w:rPr>
-          <w:lang w:val="fr-MA"/>
-        </w:rPr>
-        <w:t>des liens envoyés</w:t>
-      </w:r>
-      <w:r>
-        <w:rPr>
-          <w:lang w:val="fr-MA"/>
-        </w:rPr>
-        <w:t xml:space="preserve"> par mail</w:t>
-      </w:r>
-    </w:p>
-    <w:p>
-      <w:pPr>
-        <w:rPr>
-          <w:lang w:val="fr-MA"/>
-        </w:rPr>
-      </w:pPr>
-      <w:r>
-        <w:rPr>
-          <w:lang w:val="fr-MA"/>
-        </w:rPr>
-        <w:t>* Gérer les accès du collaborateur, créer un mapping matricule/fonction (DA/CC/DGA…)</w:t>
-      </w:r>
-      <w:r>
-        <w:rPr>
-          <w:lang w:val="fr-MA"/>
-        </w:rPr>
-        <w:t xml:space="preserve"> dans une nouvelle table</w:t>
-      </w:r>
+        <w:t xml:space="preserve">* Fonctionnement de l'import d'une cible (verrouiller le comportement des campagnes et du batch vis à vis des cibles importer via fichier Excel, confirmer la possibilité de rajouter les cibles importées dans la base de données comme des prospect // incompatible avec une structure de SAS) </w:t>
+      </w:r>
+    </w:p>
+    <w:p>
+      <w:pPr>
+        <w:rPr>
+          <w:lang w:val="fr-MA"/>
+        </w:rPr>
+      </w:pPr>
       <w:r>
         <w:rPr>
           <w:lang w:val="fr-MA"/>
@@ -283,82 +555,7 @@
         <w:rPr>
           <w:lang w:val="fr-MA"/>
         </w:rPr>
-        <w:t xml:space="preserve">* Archive des campagnes dans l'interface </w:t>
-      </w:r>
-      <w:r>
-        <w:rPr>
-          <w:b/>
-          <w:bCs/>
-          <w:lang w:val="fr-MA"/>
-        </w:rPr>
-        <w:t xml:space="preserve">**(sera fait au niveau du front avec </w:t>
-      </w:r>
-      <w:proofErr w:type="gramStart"/>
-      <w:r>
-        <w:rPr>
-          <w:b/>
-          <w:bCs/>
-          <w:lang w:val="fr-MA"/>
-        </w:rPr>
-        <w:t>l'API)*</w:t>
-      </w:r>
-      <w:proofErr w:type="gramEnd"/>
-      <w:r>
-        <w:rPr>
-          <w:b/>
-          <w:bCs/>
-          <w:lang w:val="fr-MA"/>
-        </w:rPr>
-        <w:t>*</w:t>
-      </w:r>
-    </w:p>
-    <w:p>
-      <w:pPr>
-        <w:rPr>
-          <w:lang w:val="fr-MA"/>
-        </w:rPr>
-      </w:pPr>
-      <w:r>
-        <w:rPr>
-          <w:lang w:val="fr-MA"/>
-        </w:rPr>
-        <w:t xml:space="preserve">* Retirer modifier modèle/cible du back </w:t>
-      </w:r>
-      <w:r>
-        <w:rPr>
-          <w:b/>
-          <w:bCs/>
-          <w:lang w:val="fr-MA"/>
-        </w:rPr>
-        <w:t xml:space="preserve">**(sera fait au niveau du front, duplication + </w:t>
-      </w:r>
-      <w:proofErr w:type="spellStart"/>
-      <w:proofErr w:type="gramStart"/>
-      <w:r>
-        <w:rPr>
-          <w:b/>
-          <w:bCs/>
-          <w:lang w:val="fr-MA"/>
-        </w:rPr>
-        <w:t>modifs</w:t>
-      </w:r>
-      <w:proofErr w:type="spellEnd"/>
-      <w:r>
-        <w:rPr>
-          <w:b/>
-          <w:bCs/>
-          <w:lang w:val="fr-MA"/>
-        </w:rPr>
-        <w:t>)*</w:t>
-      </w:r>
-      <w:proofErr w:type="gramEnd"/>
-      <w:r>
-        <w:rPr>
-          <w:b/>
-          <w:bCs/>
-          <w:lang w:val="fr-MA"/>
-        </w:rPr>
-        <w:t>*</w:t>
+        <w:t>======== Optimisation ========</w:t>
       </w:r>
     </w:p>
     <w:p>
@@ -384,54 +581,98 @@
         <w:rPr>
           <w:lang w:val="fr-MA"/>
         </w:rPr>
-        <w:t>* Etat modèle et état cible (Supprimé ou Actif, les modèles supprimés ne disparaitrons plus définitivement)</w:t>
-      </w:r>
-    </w:p>
-    <w:p>
-      <w:pPr>
-        <w:rPr>
-          <w:lang w:val="fr-MA"/>
-        </w:rPr>
-      </w:pPr>
-      <w:r>
-        <w:rPr>
-          <w:lang w:val="fr-MA"/>
-        </w:rPr>
-        <w:t>* Quand DA ou CC viennent après Appel, ajouter une interface de choix des horaires (synchronisé avec Outlook / Lotus note)</w:t>
-      </w:r>
-    </w:p>
-    <w:p>
-      <w:pPr>
-        <w:rPr>
-          <w:lang w:val="fr-MA"/>
-        </w:rPr>
-      </w:pPr>
-      <w:r>
-        <w:rPr>
-          <w:lang w:val="fr-MA"/>
-        </w:rPr>
-        <w:t xml:space="preserve">* Sur serveur, Rendre batch manuel </w:t>
-      </w:r>
-      <w:proofErr w:type="spellStart"/>
-      <w:r>
-        <w:rPr>
-          <w:lang w:val="fr-MA"/>
-        </w:rPr>
-        <w:t>schedulable</w:t>
-      </w:r>
-      <w:proofErr w:type="spellEnd"/>
-    </w:p>
-    <w:p>
-      <w:pPr>
-        <w:rPr>
-          <w:lang w:val="fr-MA"/>
-        </w:rPr>
-      </w:pPr>
-      <w:r>
-        <w:rPr>
-          <w:lang w:val="fr-MA"/>
-        </w:rPr>
-        <w:t>* Ajouter les tiers dans ls tables clients et client\_campagne</w:t>
+        <w:t>* Optimiser l'envoi des mails (faire la récurrence par ligne quand appelé depuis le centre de contact client)</w:t>
+      </w:r>
+    </w:p>
+    <w:p>
+      <w:pPr>
+        <w:rPr>
+          <w:lang w:val="fr-MA"/>
+        </w:rPr>
+      </w:pPr>
+      <w:r>
+        <w:rPr>
+          <w:lang w:val="fr-MA"/>
+        </w:rPr>
+        <w:t>* Chercher un moyen d'optimiser la gestion des grosses cibles (par exemple une cible à 5000 clients avec envoie d'email met trop de temps à se lancer)</w:t>
+      </w:r>
+    </w:p>
+    <w:p>
+      <w:pPr>
+        <w:rPr>
+          <w:lang w:val="fr-MA"/>
+        </w:rPr>
+      </w:pPr>
+    </w:p>
+    <w:p>
+      <w:pPr>
+        <w:rPr>
+          <w:lang w:val="fr-MA"/>
+        </w:rPr>
+      </w:pPr>
+      <w:r>
+        <w:rPr>
+          <w:lang w:val="fr-MA"/>
+        </w:rPr>
+        <w:t>    - Trouver un moyen de garder les mails connectés (1 connexion SMTP + 1 login prend trop de temps)</w:t>
+      </w:r>
+    </w:p>
+    <w:p>
+      <w:pPr>
+        <w:rPr>
+          <w:lang w:val="fr-MA"/>
+        </w:rPr>
+      </w:pPr>
+      <w:r>
+        <w:rPr>
+          <w:lang w:val="fr-MA"/>
+        </w:rPr>
+        <w:t xml:space="preserve">*  </w:t>
+      </w:r>
+      <w:r>
+        <w:rPr>
+          <w:lang w:val="fr-MA"/>
+        </w:rPr>
+        <w:t>Meilleure interface</w:t>
+      </w:r>
+      <w:r>
+        <w:rPr>
+          <w:lang w:val="fr-MA"/>
+        </w:rPr>
+        <w:t xml:space="preserve"> de rédaction des mails, avec le respect de la mise en page</w:t>
+      </w:r>
+    </w:p>
+    <w:p>
+      <w:pPr>
+        <w:rPr>
+          <w:lang w:val="fr-MA"/>
+        </w:rPr>
+      </w:pPr>
+    </w:p>
+    <w:p>
+      <w:pPr>
+        <w:rPr>
+          <w:lang w:val="fr-MA"/>
+        </w:rPr>
+      </w:pPr>
+      <w:r>
+        <w:rPr>
+          <w:lang w:val="fr-MA"/>
+        </w:rPr>
+        <w:t>* Chercher un moyen de créer des queues d'action (l'appli ne dois pas bloquer après le clique sur un bouton le temps du traitement)</w:t>
+      </w:r>
+    </w:p>
+    <w:p>
+      <w:pPr>
+        <w:rPr>
+          <w:lang w:val="fr-MA"/>
+        </w:rPr>
+      </w:pPr>
+      <w:r>
+        <w:rPr>
+          <w:lang w:val="fr-MA"/>
+        </w:rPr>
+        <w:t>* Migrer vers une architecture big data</w:t>
       </w:r>
     </w:p>
     <w:p>
@@ -457,21 +698,7 @@
         <w:rPr>
           <w:lang w:val="fr-MA"/>
         </w:rPr>
-        <w:t xml:space="preserve">======== </w:t>
-      </w:r>
-      <w:proofErr w:type="spellStart"/>
-      <w:r>
-        <w:rPr>
-          <w:lang w:val="fr-MA"/>
-        </w:rPr>
-        <w:t>Modifs</w:t>
-      </w:r>
-      <w:proofErr w:type="spellEnd"/>
-      <w:r>
-        <w:rPr>
-          <w:lang w:val="fr-MA"/>
-        </w:rPr>
-        <w:t xml:space="preserve"> ========</w:t>
+        <w:t>======== API ========</w:t>
       </w:r>
     </w:p>
     <w:p>
@@ -497,7 +724,7 @@
         <w:rPr>
           <w:lang w:val="fr-MA"/>
         </w:rPr>
-        <w:t xml:space="preserve">* CSV Conforme à la base de données </w:t>
+        <w:t xml:space="preserve">* Réparer API demandé par sisba (conv wtsp) </w:t>
       </w:r>
       <w:r>
         <w:rPr>
@@ -506,9 +733,21 @@
           <w:color w:val="00B050"/>
           <w:lang w:val="fr-MA"/>
         </w:rPr>
-        <w:t>**(Done</w:t>
-      </w:r>
-      <w:proofErr w:type="gramStart"/>
+        <w:t>**(Done)**</w:t>
+      </w:r>
+    </w:p>
+    <w:p>
+      <w:pPr>
+        <w:rPr>
+          <w:lang w:val="fr-MA"/>
+        </w:rPr>
+      </w:pPr>
+      <w:r>
+        <w:rPr>
+          <w:lang w:val="fr-MA"/>
+        </w:rPr>
+        <w:t xml:space="preserve">* API Dashboard avec sisba (filtrer sur une seule campagne) </w:t>
+      </w:r>
       <w:r>
         <w:rPr>
           <w:b/>
@@ -516,9 +755,21 @@
           <w:color w:val="00B050"/>
           <w:lang w:val="fr-MA"/>
         </w:rPr>
-        <w:t>) ::::::::::</w:t>
-      </w:r>
-      <w:proofErr w:type="gramEnd"/>
+        <w:t>**(Done)**</w:t>
+      </w:r>
+    </w:p>
+    <w:p>
+      <w:pPr>
+        <w:rPr>
+          <w:lang w:val="fr-MA"/>
+        </w:rPr>
+      </w:pPr>
+      <w:r>
+        <w:rPr>
+          <w:lang w:val="fr-MA"/>
+        </w:rPr>
+        <w:t xml:space="preserve">* Ajouter le nombre de conversion dans l'api du graphe de Flow </w:t>
+      </w:r>
       <w:r>
         <w:rPr>
           <w:b/>
@@ -526,20 +777,20 @@
           <w:color w:val="00B050"/>
           <w:lang w:val="fr-MA"/>
         </w:rPr>
-        <w:t xml:space="preserve"> Fournir exemple pour tester**</w:t>
-      </w:r>
-    </w:p>
-    <w:p>
-      <w:pPr>
-        <w:rPr>
-          <w:lang w:val="fr-MA"/>
-        </w:rPr>
-      </w:pPr>
-      <w:r>
-        <w:rPr>
-          <w:lang w:val="fr-MA"/>
-        </w:rPr>
-        <w:t xml:space="preserve">* Cible de la campagne se met à jour avec le batch (s'il y'a de nouveaux clients) </w:t>
+        <w:t>**(Done)**</w:t>
+      </w:r>
+    </w:p>
+    <w:p>
+      <w:pPr>
+        <w:rPr>
+          <w:lang w:val="fr-MA"/>
+        </w:rPr>
+      </w:pPr>
+      <w:r>
+        <w:rPr>
+          <w:lang w:val="fr-MA"/>
+        </w:rPr>
+        <w:t xml:space="preserve">* Ajouter les stats de la campagne dans l'API Get campagne + les campagnes annulées </w:t>
       </w:r>
       <w:r>
         <w:rPr>
@@ -561,14 +812,8 @@
         <w:rPr>
           <w:lang w:val="fr-MA"/>
         </w:rPr>
-        <w:t xml:space="preserve">* Fonctionnement de l'import d'une cible (verrouiller le comportement des campagnes et du batch vis à vis des cibles importer via fichier Excel, confirmer la possibilité de rajouter les cibles </w:t>
-      </w:r>
-      <w:r>
-        <w:rPr>
-          <w:lang w:val="fr-MA"/>
-        </w:rPr>
         <w:lastRenderedPageBreak/>
-        <w:t xml:space="preserve">importées dans la base de données comme des prospect // incompatible avec une structure de SAS) </w:t>
+        <w:t>* Envoyer les modèle et cible supprimés dans l'api</w:t>
       </w:r>
     </w:p>
     <w:p>
@@ -583,171 +828,12 @@
         </w:rPr>
         <w:br/>
       </w:r>
-    </w:p>
-    <w:p>
-      <w:pPr>
-        <w:rPr>
-          <w:lang w:val="fr-MA"/>
-        </w:rPr>
-      </w:pPr>
-      <w:r>
-        <w:rPr>
-          <w:lang w:val="fr-MA"/>
-        </w:rPr>
-        <w:t>======== Optimisation ========</w:t>
-      </w:r>
-    </w:p>
-    <w:p>
-      <w:pPr>
-        <w:rPr>
-          <w:lang w:val="fr-MA"/>
-        </w:rPr>
-      </w:pPr>
       <w:r>
         <w:rPr>
           <w:lang w:val="fr-MA"/>
         </w:rPr>
         <w:br/>
       </w:r>
-    </w:p>
-    <w:p>
-      <w:pPr>
-        <w:rPr>
-          <w:lang w:val="fr-MA"/>
-        </w:rPr>
-      </w:pPr>
-      <w:r>
-        <w:rPr>
-          <w:lang w:val="fr-MA"/>
-        </w:rPr>
-        <w:t>* Optimiser l'envoi des mails (faire la récurrence par ligne quand appelé depuis le centre de contact client)</w:t>
-      </w:r>
-    </w:p>
-    <w:p>
-      <w:pPr>
-        <w:rPr>
-          <w:lang w:val="fr-MA"/>
-        </w:rPr>
-      </w:pPr>
-      <w:r>
-        <w:rPr>
-          <w:lang w:val="fr-MA"/>
-        </w:rPr>
-        <w:t xml:space="preserve">* Chercher un moyen d'optimiser la gestion des grosses cibles (par exemple une cible à 5000 clients avec envoie </w:t>
-      </w:r>
-      <w:proofErr w:type="gramStart"/>
-      <w:r>
-        <w:rPr>
-          <w:lang w:val="fr-MA"/>
-        </w:rPr>
-        <w:t>d'email</w:t>
-      </w:r>
-      <w:proofErr w:type="gramEnd"/>
-      <w:r>
-        <w:rPr>
-          <w:lang w:val="fr-MA"/>
-        </w:rPr>
-        <w:t xml:space="preserve"> met trop de temps à se lancer)</w:t>
-      </w:r>
-    </w:p>
-    <w:p>
-      <w:pPr>
-        <w:rPr>
-          <w:lang w:val="fr-MA"/>
-        </w:rPr>
-      </w:pPr>
-    </w:p>
-    <w:p>
-      <w:pPr>
-        <w:rPr>
-          <w:lang w:val="fr-MA"/>
-        </w:rPr>
-      </w:pPr>
-      <w:r>
-        <w:rPr>
-          <w:lang w:val="fr-MA"/>
-        </w:rPr>
-        <w:t>    - Trouver un moyen de garder les mails connectés (1 connexion SMTP + 1 login prend trop de temps)</w:t>
-      </w:r>
-    </w:p>
-    <w:p>
-      <w:pPr>
-        <w:rPr>
-          <w:lang w:val="fr-MA"/>
-        </w:rPr>
-      </w:pPr>
-      <w:r>
-        <w:rPr>
-          <w:lang w:val="fr-MA"/>
-        </w:rPr>
-        <w:t xml:space="preserve">*  </w:t>
-      </w:r>
-      <w:r>
-        <w:rPr>
-          <w:lang w:val="fr-MA"/>
-        </w:rPr>
-        <w:t>Meilleure interface</w:t>
-      </w:r>
-      <w:r>
-        <w:rPr>
-          <w:lang w:val="fr-MA"/>
-        </w:rPr>
-        <w:t xml:space="preserve"> de rédaction des mails, avec le respect de la mise en page</w:t>
-      </w:r>
-    </w:p>
-    <w:p>
-      <w:pPr>
-        <w:rPr>
-          <w:lang w:val="fr-MA"/>
-        </w:rPr>
-      </w:pPr>
-    </w:p>
-    <w:p>
-      <w:pPr>
-        <w:rPr>
-          <w:lang w:val="fr-MA"/>
-        </w:rPr>
-      </w:pPr>
-      <w:r>
-        <w:rPr>
-          <w:lang w:val="fr-MA"/>
-        </w:rPr>
-        <w:t xml:space="preserve">* Chercher un moyen de créer des queues d'action (l'appli ne dois pas bloquer après </w:t>
-      </w:r>
-      <w:proofErr w:type="gramStart"/>
-      <w:r>
-        <w:rPr>
-          <w:lang w:val="fr-MA"/>
-        </w:rPr>
-        <w:t>le clique</w:t>
-      </w:r>
-      <w:proofErr w:type="gramEnd"/>
-      <w:r>
-        <w:rPr>
-          <w:lang w:val="fr-MA"/>
-        </w:rPr>
-        <w:t xml:space="preserve"> sur un bouton le temps du traitement)</w:t>
-      </w:r>
-    </w:p>
-    <w:p>
-      <w:pPr>
-        <w:rPr>
-          <w:lang w:val="fr-MA"/>
-        </w:rPr>
-      </w:pPr>
-      <w:r>
-        <w:rPr>
-          <w:lang w:val="fr-MA"/>
-        </w:rPr>
-        <w:t>* Migrer vers une architecture big data</w:t>
-      </w:r>
-    </w:p>
-    <w:p>
-      <w:pPr>
-        <w:rPr>
-          <w:lang w:val="fr-MA"/>
-        </w:rPr>
-      </w:pPr>
       <w:r>
         <w:rPr>
           <w:lang w:val="fr-MA"/>
@@ -765,7 +851,7 @@
         <w:rPr>
           <w:lang w:val="fr-MA"/>
         </w:rPr>
-        <w:t>======== API ========</w:t>
+        <w:t>======== Architecture ========</w:t>
       </w:r>
     </w:p>
     <w:p>
@@ -791,165 +877,288 @@
         <w:rPr>
           <w:lang w:val="fr-MA"/>
         </w:rPr>
-        <w:t xml:space="preserve">* Réparer API demandé par </w:t>
-      </w:r>
-      <w:proofErr w:type="spellStart"/>
-      <w:r>
-        <w:rPr>
-          <w:lang w:val="fr-MA"/>
-        </w:rPr>
-        <w:t>sisba</w:t>
-      </w:r>
-      <w:proofErr w:type="spellEnd"/>
-      <w:r>
-        <w:rPr>
-          <w:lang w:val="fr-MA"/>
-        </w:rPr>
-        <w:t xml:space="preserve"> (</w:t>
-      </w:r>
-      <w:proofErr w:type="spellStart"/>
-      <w:r>
-        <w:rPr>
-          <w:lang w:val="fr-MA"/>
-        </w:rPr>
-        <w:t>conv</w:t>
-      </w:r>
-      <w:proofErr w:type="spellEnd"/>
-      <w:r>
-        <w:rPr>
-          <w:lang w:val="fr-MA"/>
-        </w:rPr>
-        <w:t xml:space="preserve"> </w:t>
-      </w:r>
-      <w:proofErr w:type="spellStart"/>
-      <w:r>
-        <w:rPr>
-          <w:lang w:val="fr-MA"/>
-        </w:rPr>
-        <w:t>wtsp</w:t>
-      </w:r>
-      <w:proofErr w:type="spellEnd"/>
-      <w:r>
-        <w:rPr>
-          <w:lang w:val="fr-MA"/>
-        </w:rPr>
-        <w:t xml:space="preserve">) </w:t>
-      </w:r>
+        <w:t>\- Schéma d'extraction des données</w:t>
+      </w:r>
+    </w:p>
+    <w:p>
+      <w:pPr>
+        <w:rPr>
+          <w:lang w:val="fr-MA"/>
+        </w:rPr>
+      </w:pPr>
+      <w:r>
+        <w:rPr>
+          <w:lang w:val="fr-MA"/>
+        </w:rPr>
+        <w:br/>
+      </w:r>
+    </w:p>
+    <w:p>
+      <w:pPr>
+        <w:rPr>
+          <w:lang w:val="fr-MA"/>
+        </w:rPr>
+      </w:pPr>
       <w:r>
         <w:rPr>
           <w:b/>
           <w:bCs/>
-          <w:color w:val="00B050"/>
-          <w:lang w:val="fr-MA"/>
-        </w:rPr>
-        <w:t>**(Done)**</w:t>
-      </w:r>
-    </w:p>
-    <w:p>
-      <w:pPr>
-        <w:rPr>
-          <w:lang w:val="fr-MA"/>
-        </w:rPr>
-      </w:pPr>
-      <w:r>
-        <w:rPr>
-          <w:lang w:val="fr-MA"/>
-        </w:rPr>
-        <w:t xml:space="preserve">* API Dashboard avec </w:t>
-      </w:r>
-      <w:proofErr w:type="spellStart"/>
-      <w:r>
-        <w:rPr>
-          <w:lang w:val="fr-MA"/>
-        </w:rPr>
-        <w:t>sisba</w:t>
-      </w:r>
-      <w:proofErr w:type="spellEnd"/>
-      <w:r>
-        <w:rPr>
-          <w:lang w:val="fr-MA"/>
-        </w:rPr>
-        <w:t xml:space="preserve"> (filtrer sur une seule campagne) </w:t>
-      </w:r>
+          <w:lang w:val="fr-MA"/>
+        </w:rPr>
+        <w:t>=================================================================</w:t>
+      </w:r>
+    </w:p>
+    <w:p>
+      <w:pPr>
+        <w:rPr>
+          <w:lang w:val="fr-MA"/>
+        </w:rPr>
+      </w:pPr>
+      <w:r>
+        <w:rPr>
+          <w:lang w:val="fr-MA"/>
+        </w:rPr>
+        <w:br/>
+      </w:r>
+    </w:p>
+    <w:p>
+      <w:pPr>
+        <w:rPr>
+          <w:lang w:val="fr-MA"/>
+        </w:rPr>
+      </w:pPr>
+      <w:r>
+        <w:rPr>
+          <w:lang w:val="fr-MA"/>
+        </w:rPr>
+        <w:t>Etapes pour transformer en SaaS :</w:t>
+      </w:r>
+    </w:p>
+    <w:p>
+      <w:pPr>
+        <w:rPr>
+          <w:lang w:val="fr-MA"/>
+        </w:rPr>
+      </w:pPr>
+      <w:r>
+        <w:rPr>
+          <w:lang w:val="fr-MA"/>
+        </w:rPr>
+        <w:br/>
+      </w:r>
+    </w:p>
+    <w:p>
+      <w:pPr>
+        <w:rPr>
+          <w:lang w:val="fr-MA"/>
+        </w:rPr>
+      </w:pPr>
+      <w:r>
+        <w:rPr>
+          <w:lang w:val="fr-MA"/>
+        </w:rPr>
+        <w:t>\- Importation des données avec indication des clés importantes</w:t>
+      </w:r>
+    </w:p>
+    <w:p>
+      <w:pPr>
+        <w:rPr>
+          <w:lang w:val="fr-MA"/>
+        </w:rPr>
+      </w:pPr>
+    </w:p>
+    <w:p>
+      <w:pPr>
+        <w:rPr>
+          <w:lang w:val="fr-MA"/>
+        </w:rPr>
+      </w:pPr>
+      <w:r>
+        <w:rPr>
+          <w:lang w:val="fr-MA"/>
+        </w:rPr>
+        <w:t>    \* Ajouter une colonne id\_user, unique à chaque utilisateur. Afin de gérer les accès et les flux de données.</w:t>
+      </w:r>
+    </w:p>
+    <w:p>
+      <w:pPr>
+        <w:rPr>
+          <w:lang w:val="fr-MA"/>
+        </w:rPr>
+      </w:pPr>
+      <w:r>
+        <w:rPr>
+          <w:lang w:val="fr-MA"/>
+        </w:rPr>
+        <w:br/>
+      </w:r>
+    </w:p>
+    <w:p>
+      <w:pPr>
+        <w:rPr>
+          <w:lang w:val="fr-MA"/>
+        </w:rPr>
+      </w:pPr>
+      <w:r>
+        <w:rPr>
+          <w:lang w:val="fr-MA"/>
+        </w:rPr>
+        <w:t>    Piste 1 :</w:t>
+      </w:r>
+    </w:p>
+    <w:p>
+      <w:pPr>
+        <w:rPr>
+          <w:lang w:val="fr-MA"/>
+        </w:rPr>
+      </w:pPr>
+    </w:p>
+    <w:p>
+      <w:pPr>
+        <w:rPr>
+          <w:lang w:val="fr-MA"/>
+        </w:rPr>
+      </w:pPr>
+      <w:r>
+        <w:rPr>
+          <w:lang w:val="fr-MA"/>
+        </w:rPr>
+        <w:t>    \* Clé primaire base client (radical compte)</w:t>
+      </w:r>
+    </w:p>
+    <w:p>
+      <w:pPr>
+        <w:rPr>
+          <w:lang w:val="fr-MA"/>
+        </w:rPr>
+      </w:pPr>
+    </w:p>
+    <w:p>
+      <w:pPr>
+        <w:rPr>
+          <w:lang w:val="fr-MA"/>
+        </w:rPr>
+      </w:pPr>
+      <w:r>
+        <w:rPr>
+          <w:lang w:val="fr-MA"/>
+        </w:rPr>
+        <w:t>    \* Champs correspondant au numéro de tel et Mail</w:t>
+      </w:r>
+    </w:p>
+    <w:p>
+      <w:pPr>
+        <w:rPr>
+          <w:lang w:val="fr-MA"/>
+        </w:rPr>
+      </w:pPr>
+    </w:p>
+    <w:p>
+      <w:pPr>
+        <w:rPr>
+          <w:lang w:val="fr-MA"/>
+        </w:rPr>
+      </w:pPr>
+      <w:r>
+        <w:rPr>
+          <w:lang w:val="fr-MA"/>
+        </w:rPr>
+        <w:t>    \* Champs correspondant au gestionnaire/agence/région</w:t>
+      </w:r>
+    </w:p>
+    <w:p>
+      <w:pPr>
+        <w:rPr>
+          <w:lang w:val="fr-MA"/>
+        </w:rPr>
+      </w:pPr>
+    </w:p>
+    <w:p>
+      <w:pPr>
+        <w:rPr>
+          <w:lang w:val="fr-MA"/>
+        </w:rPr>
+      </w:pPr>
+      <w:r>
+        <w:rPr>
+          <w:lang w:val="fr-MA"/>
+        </w:rPr>
+        <w:t>    \*\* Trouver un moyen intelligent de faire l'ingestion des autres données (objectifs et filtre) sans trop d'interaction et de question avec l'utilisateur</w:t>
+      </w:r>
+    </w:p>
+    <w:p>
+      <w:pPr>
+        <w:rPr>
+          <w:lang w:val="fr-MA"/>
+        </w:rPr>
+      </w:pPr>
+      <w:r>
+        <w:rPr>
+          <w:lang w:val="fr-MA"/>
+        </w:rPr>
+        <w:br/>
+      </w:r>
+    </w:p>
+    <w:p>
+      <w:pPr>
+        <w:rPr>
+          <w:lang w:val="fr-MA"/>
+        </w:rPr>
+      </w:pPr>
+      <w:r>
+        <w:rPr>
+          <w:lang w:val="fr-MA"/>
+        </w:rPr>
+        <w:lastRenderedPageBreak/>
+        <w:t>    Piste 2 :</w:t>
+      </w:r>
+    </w:p>
+    <w:p>
+      <w:pPr>
+        <w:rPr>
+          <w:lang w:val="fr-MA"/>
+        </w:rPr>
+      </w:pPr>
+    </w:p>
+    <w:p>
+      <w:pPr>
+        <w:rPr>
+          <w:lang w:val="fr-MA"/>
+        </w:rPr>
+      </w:pPr>
+      <w:r>
+        <w:rPr>
+          <w:lang w:val="fr-MA"/>
+        </w:rPr>
+        <w:t>    \* Imposer le format des données à l'utilisateur</w:t>
+      </w:r>
+    </w:p>
+    <w:p>
+      <w:pPr>
+        <w:rPr>
+          <w:lang w:val="fr-MA"/>
+        </w:rPr>
+      </w:pPr>
+      <w:r>
+        <w:rPr>
+          <w:lang w:val="fr-MA"/>
+        </w:rPr>
+        <w:br/>
+      </w:r>
+    </w:p>
+    <w:p>
+      <w:pPr>
+        <w:rPr>
+          <w:lang w:val="fr-MA"/>
+        </w:rPr>
+      </w:pPr>
       <w:r>
         <w:rPr>
           <w:b/>
           <w:bCs/>
-          <w:color w:val="00B050"/>
-          <w:lang w:val="fr-MA"/>
-        </w:rPr>
-        <w:t>**(Done)**</w:t>
-      </w:r>
-    </w:p>
-    <w:p>
-      <w:pPr>
-        <w:rPr>
-          <w:lang w:val="fr-MA"/>
-        </w:rPr>
-      </w:pPr>
-      <w:r>
-        <w:rPr>
-          <w:lang w:val="fr-MA"/>
-        </w:rPr>
-        <w:t xml:space="preserve">* Ajouter le nombre de conversion dans l'api du graphe de Flow </w:t>
-      </w:r>
-      <w:r>
-        <w:rPr>
-          <w:b/>
-          <w:bCs/>
-          <w:color w:val="00B050"/>
-          <w:lang w:val="fr-MA"/>
-        </w:rPr>
-        <w:t>**(Done)**</w:t>
-      </w:r>
-    </w:p>
-    <w:p>
-      <w:pPr>
-        <w:rPr>
-          <w:lang w:val="fr-MA"/>
-        </w:rPr>
-      </w:pPr>
-      <w:r>
-        <w:rPr>
-          <w:lang w:val="fr-MA"/>
-        </w:rPr>
-        <w:t xml:space="preserve">* Ajouter les stats de la campagne dans l'API </w:t>
-      </w:r>
-      <w:proofErr w:type="spellStart"/>
-      <w:r>
-        <w:rPr>
-          <w:lang w:val="fr-MA"/>
-        </w:rPr>
-        <w:t>Get</w:t>
-      </w:r>
-      <w:proofErr w:type="spellEnd"/>
-      <w:r>
-        <w:rPr>
-          <w:lang w:val="fr-MA"/>
-        </w:rPr>
-        <w:t xml:space="preserve"> campagne + les campagnes annulées </w:t>
-      </w:r>
-      <w:r>
-        <w:rPr>
-          <w:b/>
-          <w:bCs/>
-          <w:color w:val="00B050"/>
-          <w:lang w:val="fr-MA"/>
-        </w:rPr>
-        <w:t>**(Done)**</w:t>
-      </w:r>
-    </w:p>
-    <w:p>
-      <w:pPr>
-        <w:rPr>
-          <w:lang w:val="fr-MA"/>
-        </w:rPr>
-      </w:pPr>
-      <w:r>
-        <w:rPr>
-          <w:lang w:val="fr-MA"/>
-        </w:rPr>
-        <w:t>* Envoyer les modèle et cible supprimés dans l'api</w:t>
+          <w:lang w:val="fr-MA"/>
+        </w:rPr>
+        <w:t>=================================================================</w:t>
       </w:r>
     </w:p>
     <w:p>
@@ -964,378 +1173,32 @@
         </w:rPr>
         <w:br/>
       </w:r>
+    </w:p>
+    <w:p>
+      <w:pPr>
+        <w:rPr>
+          <w:lang w:val="fr-MA"/>
+        </w:rPr>
+      </w:pPr>
+      <w:r>
+        <w:rPr>
+          <w:lang w:val="fr-MA"/>
+        </w:rPr>
+        <w:t>Axe d'amélioration :</w:t>
+      </w:r>
+    </w:p>
+    <w:p>
+      <w:pPr>
+        <w:rPr>
+          <w:lang w:val="fr-MA"/>
+        </w:rPr>
+      </w:pPr>
       <w:r>
         <w:rPr>
           <w:lang w:val="fr-MA"/>
         </w:rPr>
         <w:br/>
       </w:r>
-      <w:r>
-        <w:rPr>
-          <w:lang w:val="fr-MA"/>
-        </w:rPr>
-        <w:br/>
-      </w:r>
-    </w:p>
-    <w:p>
-      <w:pPr>
-        <w:rPr>
-          <w:lang w:val="fr-MA"/>
-        </w:rPr>
-      </w:pPr>
-      <w:r>
-        <w:rPr>
-          <w:lang w:val="fr-MA"/>
-        </w:rPr>
-        <w:t>======== Architecture ========</w:t>
-      </w:r>
-    </w:p>
-    <w:p>
-      <w:pPr>
-        <w:rPr>
-          <w:lang w:val="fr-MA"/>
-        </w:rPr>
-      </w:pPr>
-      <w:r>
-        <w:rPr>
-          <w:lang w:val="fr-MA"/>
-        </w:rPr>
-        <w:lastRenderedPageBreak/>
-        <w:br/>
-      </w:r>
-    </w:p>
-    <w:p>
-      <w:pPr>
-        <w:rPr>
-          <w:lang w:val="fr-MA"/>
-        </w:rPr>
-      </w:pPr>
-      <w:r>
-        <w:rPr>
-          <w:lang w:val="fr-MA"/>
-        </w:rPr>
-        <w:t>\- Schéma d'extraction des données</w:t>
-      </w:r>
-    </w:p>
-    <w:p>
-      <w:pPr>
-        <w:rPr>
-          <w:lang w:val="fr-MA"/>
-        </w:rPr>
-      </w:pPr>
-      <w:r>
-        <w:rPr>
-          <w:lang w:val="fr-MA"/>
-        </w:rPr>
-        <w:br/>
-      </w:r>
-    </w:p>
-    <w:p>
-      <w:pPr>
-        <w:rPr>
-          <w:lang w:val="fr-MA"/>
-        </w:rPr>
-      </w:pPr>
-      <w:r>
-        <w:rPr>
-          <w:b/>
-          <w:bCs/>
-          <w:lang w:val="fr-MA"/>
-        </w:rPr>
-        <w:t>=================================================================</w:t>
-      </w:r>
-    </w:p>
-    <w:p>
-      <w:pPr>
-        <w:rPr>
-          <w:lang w:val="fr-MA"/>
-        </w:rPr>
-      </w:pPr>
-      <w:r>
-        <w:rPr>
-          <w:lang w:val="fr-MA"/>
-        </w:rPr>
-        <w:br/>
-      </w:r>
-    </w:p>
-    <w:p>
-      <w:pPr>
-        <w:rPr>
-          <w:lang w:val="fr-MA"/>
-        </w:rPr>
-      </w:pPr>
-      <w:r>
-        <w:rPr>
-          <w:lang w:val="fr-MA"/>
-        </w:rPr>
-        <w:t>Etapes pour transformer en SaaS :</w:t>
-      </w:r>
-    </w:p>
-    <w:p>
-      <w:pPr>
-        <w:rPr>
-          <w:lang w:val="fr-MA"/>
-        </w:rPr>
-      </w:pPr>
-      <w:r>
-        <w:rPr>
-          <w:lang w:val="fr-MA"/>
-        </w:rPr>
-        <w:br/>
-      </w:r>
-    </w:p>
-    <w:p>
-      <w:pPr>
-        <w:rPr>
-          <w:lang w:val="fr-MA"/>
-        </w:rPr>
-      </w:pPr>
-      <w:r>
-        <w:rPr>
-          <w:lang w:val="fr-MA"/>
-        </w:rPr>
-        <w:t>\- Importation des données avec indication des clés importantes</w:t>
-      </w:r>
-    </w:p>
-    <w:p>
-      <w:pPr>
-        <w:rPr>
-          <w:lang w:val="fr-MA"/>
-        </w:rPr>
-      </w:pPr>
-    </w:p>
-    <w:p>
-      <w:pPr>
-        <w:rPr>
-          <w:lang w:val="fr-MA"/>
-        </w:rPr>
-      </w:pPr>
-      <w:r>
-        <w:rPr>
-          <w:lang w:val="fr-MA"/>
-        </w:rPr>
-        <w:t>    \* Ajouter une colonne id\_user, unique à chaque utilisateur. Afin de gérer les accès et les flux de données.</w:t>
-      </w:r>
-    </w:p>
-    <w:p>
-      <w:pPr>
-        <w:rPr>
-          <w:lang w:val="fr-MA"/>
-        </w:rPr>
-      </w:pPr>
-      <w:r>
-        <w:rPr>
-          <w:lang w:val="fr-MA"/>
-        </w:rPr>
-        <w:br/>
-      </w:r>
-    </w:p>
-    <w:p>
-      <w:pPr>
-        <w:rPr>
-          <w:lang w:val="fr-MA"/>
-        </w:rPr>
-      </w:pPr>
-      <w:r>
-        <w:rPr>
-          <w:lang w:val="fr-MA"/>
-        </w:rPr>
-        <w:t>    Piste 1 :</w:t>
-      </w:r>
-    </w:p>
-    <w:p>
-      <w:pPr>
-        <w:rPr>
-          <w:lang w:val="fr-MA"/>
-        </w:rPr>
-      </w:pPr>
-    </w:p>
-    <w:p>
-      <w:pPr>
-        <w:rPr>
-          <w:lang w:val="fr-MA"/>
-        </w:rPr>
-      </w:pPr>
-      <w:r>
-        <w:rPr>
-          <w:lang w:val="fr-MA"/>
-        </w:rPr>
-        <w:t>    \* Clé primaire base client (radical compte)</w:t>
-      </w:r>
-    </w:p>
-    <w:p>
-      <w:pPr>
-        <w:rPr>
-          <w:lang w:val="fr-MA"/>
-        </w:rPr>
-      </w:pPr>
-    </w:p>
-    <w:p>
-      <w:pPr>
-        <w:rPr>
-          <w:lang w:val="fr-MA"/>
-        </w:rPr>
-      </w:pPr>
-      <w:r>
-        <w:rPr>
-          <w:lang w:val="fr-MA"/>
-        </w:rPr>
-        <w:t>    \* Champs correspondant au numéro de tel et Mail</w:t>
-      </w:r>
-    </w:p>
-    <w:p>
-      <w:pPr>
-        <w:rPr>
-          <w:lang w:val="fr-MA"/>
-        </w:rPr>
-      </w:pPr>
-    </w:p>
-    <w:p>
-      <w:pPr>
-        <w:rPr>
-          <w:lang w:val="fr-MA"/>
-        </w:rPr>
-      </w:pPr>
-      <w:r>
-        <w:rPr>
-          <w:lang w:val="fr-MA"/>
-        </w:rPr>
-        <w:t>    \* Champs correspondant au gestionnaire/agence/région</w:t>
-      </w:r>
-    </w:p>
-    <w:p>
-      <w:pPr>
-        <w:rPr>
-          <w:lang w:val="fr-MA"/>
-        </w:rPr>
-      </w:pPr>
-    </w:p>
-    <w:p>
-      <w:pPr>
-        <w:rPr>
-          <w:lang w:val="fr-MA"/>
-        </w:rPr>
-      </w:pPr>
-      <w:r>
-        <w:rPr>
-          <w:lang w:val="fr-MA"/>
-        </w:rPr>
-        <w:t>    \*\* Trouver un moyen intelligent de faire l'ingestion des autres données (objectifs et filtre) sans trop d'interaction et de question avec l'utilisateur</w:t>
-      </w:r>
-    </w:p>
-    <w:p>
-      <w:pPr>
-        <w:rPr>
-          <w:lang w:val="fr-MA"/>
-        </w:rPr>
-      </w:pPr>
-      <w:r>
-        <w:rPr>
-          <w:lang w:val="fr-MA"/>
-        </w:rPr>
-        <w:br/>
-      </w:r>
-    </w:p>
-    <w:p>
-      <w:pPr>
-        <w:rPr>
-          <w:lang w:val="fr-MA"/>
-        </w:rPr>
-      </w:pPr>
-      <w:r>
-        <w:rPr>
-          <w:lang w:val="fr-MA"/>
-        </w:rPr>
-        <w:t>    Piste 2 :</w:t>
-      </w:r>
-    </w:p>
-    <w:p>
-      <w:pPr>
-        <w:rPr>
-          <w:lang w:val="fr-MA"/>
-        </w:rPr>
-      </w:pPr>
-    </w:p>
-    <w:p>
-      <w:pPr>
-        <w:rPr>
-          <w:lang w:val="fr-MA"/>
-        </w:rPr>
-      </w:pPr>
-      <w:r>
-        <w:rPr>
-          <w:lang w:val="fr-MA"/>
-        </w:rPr>
-        <w:t>    \* Imposer le format des données à l'utilisateur</w:t>
-      </w:r>
-    </w:p>
-    <w:p>
-      <w:pPr>
-        <w:rPr>
-          <w:lang w:val="fr-MA"/>
-        </w:rPr>
-      </w:pPr>
-      <w:r>
-        <w:rPr>
-          <w:lang w:val="fr-MA"/>
-        </w:rPr>
-        <w:br/>
-      </w:r>
-    </w:p>
-    <w:p>
-      <w:pPr>
-        <w:rPr>
-          <w:lang w:val="fr-MA"/>
-        </w:rPr>
-      </w:pPr>
-      <w:r>
-        <w:rPr>
-          <w:b/>
-          <w:bCs/>
-          <w:lang w:val="fr-MA"/>
-        </w:rPr>
-        <w:lastRenderedPageBreak/>
-        <w:t>=================================================================</w:t>
-      </w:r>
-    </w:p>
-    <w:p>
-      <w:pPr>
-        <w:rPr>
-          <w:lang w:val="fr-MA"/>
-        </w:rPr>
-      </w:pPr>
-      <w:r>
-        <w:rPr>
-          <w:lang w:val="fr-MA"/>
-        </w:rPr>
-        <w:br/>
-      </w:r>
-    </w:p>
-    <w:p>
-      <w:pPr>
-        <w:rPr>
-          <w:lang w:val="fr-MA"/>
-        </w:rPr>
-      </w:pPr>
-      <w:r>
-        <w:rPr>
-          <w:lang w:val="fr-MA"/>
-        </w:rPr>
-        <w:t>Axe d'amélioration :</w:t>
-      </w:r>
-    </w:p>
-    <w:p>
-      <w:pPr>
-        <w:rPr>
-          <w:lang w:val="fr-MA"/>
-        </w:rPr>
-      </w:pPr>
-      <w:r>
-        <w:rPr>
-          <w:lang w:val="fr-MA"/>
-        </w:rPr>
-        <w:br/>
-      </w:r>
     </w:p>
     <w:p>
       <w:pPr>
@@ -1397,21 +1260,7 @@
         <w:rPr>
           <w:lang w:val="fr-MA"/>
         </w:rPr>
-        <w:t xml:space="preserve">(à la création de campagne, lorsque la cible est choisie, un flag ‘des clients de cette liste </w:t>
-      </w:r>
-      <w:proofErr w:type="gramStart"/>
-      <w:r>
-        <w:rPr>
-          <w:lang w:val="fr-MA"/>
-        </w:rPr>
-        <w:t>ont</w:t>
-      </w:r>
-      <w:proofErr w:type="gramEnd"/>
-      <w:r>
-        <w:rPr>
-          <w:lang w:val="fr-MA"/>
-        </w:rPr>
-        <w:t xml:space="preserve"> été contactés récemment’)</w:t>
+        <w:t>(à la création de campagne, lorsque la cible est choisie, un flag ‘des clients de cette liste ont été contactés récemment’)</w:t>
       </w:r>
       <w:r>
         <w:rPr>
@@ -1437,21 +1286,7 @@
         <w:rPr>
           <w:lang w:val="fr-MA"/>
         </w:rPr>
-        <w:t xml:space="preserve">* Rendre toutes la plateforme </w:t>
-      </w:r>
-      <w:proofErr w:type="spellStart"/>
-      <w:r>
-        <w:rPr>
-          <w:lang w:val="fr-MA"/>
-        </w:rPr>
-        <w:t>customizable</w:t>
-      </w:r>
-      <w:proofErr w:type="spellEnd"/>
-      <w:r>
-        <w:rPr>
-          <w:lang w:val="fr-MA"/>
-        </w:rPr>
-        <w:t> : importation des données, choix des variables clés, choix des variables motrice, choix des scénarios possible, définition des rôles</w:t>
+        <w:t>* Rendre toutes la plateforme customizable : importation des données, choix des variables clés, choix des variables motrice, choix des scénarios possible, définition des rôles</w:t>
       </w:r>
       <w:r>
         <w:rPr>

</xml_diff>